<commit_message>
Add module B19 Testing in depth: eight lessons, a testing lab and checker support for pytest
Track B gains B19 after B17: how pytest collects and reports tests, fixtures,
parametrize, testing pandas and NumPy, statistical and random code, ML
pipelines, fakes and mocks, and coverage, markers and CI. Every lesson has five
exercise types, and every API behaviour was run on the Pyodide pins and the dev
pins. The browser exercises were run in Pyodide 314.

labs/testing holds a small package and a reference suite with 100% branch
coverage; tests/content/test_testing_lab.py keeps it that way in CI. The
checker now reports pytest outcome exceptions, such as a pytest.raises that
saw no error, as failed checks instead of crashing. pytest-cov joins the dev
group.

Co-Authored-By: Claude Opus 5.5 <noreply@anthropic.com>
Claude-Session: https://claude.ai/code/session_01115scNbPGEnHTmmnr4vEBh
</commit_message>
<xml_diff>
--- a/site/downloads/handbook-A9.docx
+++ b/site/downloads/handbook-A9.docx
@@ -1735,21 +1735,7 @@
           <w:b w:val="0"/>
           <w:i w:val="0"/>
         </w:rPr>
-        <w:t xml:space="preserve"> Functions named test_</w:t>
-      </w:r>
-      <w:r>
-        <w:rPr>
-          <w:b w:val="0"/>
-          <w:i/>
-        </w:rPr>
-        <w:t xml:space="preserve"> in files named test_</w:t>
-      </w:r>
-      <w:r>
-        <w:rPr>
-          <w:b w:val="0"/>
-          <w:i w:val="0"/>
-        </w:rPr>
-        <w:t>.py. Plain assert statements.</w:t>
+        <w:t xml:space="preserve"> Functions named test_* in files named test_*.py. Plain assert statements.</w:t>
       </w:r>
     </w:p>
     <w:p>

</xml_diff>